<commit_message>
chore: ignore TIFM_Project_Report.docx in version control
</commit_message>
<xml_diff>
--- a/TIFM_Project_Report.docx
+++ b/TIFM_Project_Report.docx
@@ -11,6 +11,9 @@
         </w:rPr>
       </w:pPr>
       <w:r>
+        <w:rPr>
+          <w:noProof/>
+        </w:rPr>
         <w:drawing>
           <wp:inline distT="0" distB="0" distL="0" distR="0" wp14:anchorId="44660447" wp14:editId="18BEE3C6">
             <wp:extent cx="838200" cy="835676"/>
@@ -101,7 +104,7 @@
           <w:sz w:val="28"/>
           <w:szCs w:val="28"/>
         </w:rPr>
-        <w:t>Telecom Intelligence &amp; Forensics Module (TIFM)</w:t>
+        <w:t>ARGUS – Advanced Records &amp; Geospatial Unified Surveillance</w:t>
       </w:r>
     </w:p>
     <w:p>
@@ -1829,12 +1832,6 @@
         <w:gridCol w:w="6960"/>
       </w:tblGrid>
       <w:tr>
-        <w:tblPrEx>
-          <w:tblCellMar>
-            <w:top w:w="0" w:type="dxa"/>
-            <w:bottom w:w="0" w:type="dxa"/>
-          </w:tblCellMar>
-        </w:tblPrEx>
         <w:trPr>
           <w:tblHeader/>
         </w:trPr>
@@ -1898,12 +1895,6 @@
         </w:tc>
       </w:tr>
       <w:tr>
-        <w:tblPrEx>
-          <w:tblCellMar>
-            <w:top w:w="0" w:type="dxa"/>
-            <w:bottom w:w="0" w:type="dxa"/>
-          </w:tblCellMar>
-        </w:tblPrEx>
         <w:tc>
           <w:tcPr>
             <w:tcW w:w="2400" w:type="dxa"/>
@@ -1976,12 +1967,6 @@
         </w:tc>
       </w:tr>
       <w:tr>
-        <w:tblPrEx>
-          <w:tblCellMar>
-            <w:top w:w="0" w:type="dxa"/>
-            <w:bottom w:w="0" w:type="dxa"/>
-          </w:tblCellMar>
-        </w:tblPrEx>
         <w:tc>
           <w:tcPr>
             <w:tcW w:w="2400" w:type="dxa"/>
@@ -2317,12 +2302,6 @@
         <w:gridCol w:w="6160"/>
       </w:tblGrid>
       <w:tr>
-        <w:tblPrEx>
-          <w:tblCellMar>
-            <w:top w:w="0" w:type="dxa"/>
-            <w:bottom w:w="0" w:type="dxa"/>
-          </w:tblCellMar>
-        </w:tblPrEx>
         <w:trPr>
           <w:tblHeader/>
         </w:trPr>
@@ -2386,12 +2365,6 @@
         </w:tc>
       </w:tr>
       <w:tr>
-        <w:tblPrEx>
-          <w:tblCellMar>
-            <w:top w:w="0" w:type="dxa"/>
-            <w:bottom w:w="0" w:type="dxa"/>
-          </w:tblCellMar>
-        </w:tblPrEx>
         <w:tc>
           <w:tcPr>
             <w:tcW w:w="3200" w:type="dxa"/>
@@ -2448,12 +2421,6 @@
         </w:tc>
       </w:tr>
       <w:tr>
-        <w:tblPrEx>
-          <w:tblCellMar>
-            <w:top w:w="0" w:type="dxa"/>
-            <w:bottom w:w="0" w:type="dxa"/>
-          </w:tblCellMar>
-        </w:tblPrEx>
         <w:tc>
           <w:tcPr>
             <w:tcW w:w="3200" w:type="dxa"/>
@@ -2535,12 +2502,6 @@
         </w:tc>
       </w:tr>
       <w:tr>
-        <w:tblPrEx>
-          <w:tblCellMar>
-            <w:top w:w="0" w:type="dxa"/>
-            <w:bottom w:w="0" w:type="dxa"/>
-          </w:tblCellMar>
-        </w:tblPrEx>
         <w:tc>
           <w:tcPr>
             <w:tcW w:w="3200" w:type="dxa"/>
@@ -2613,12 +2574,6 @@
         </w:tc>
       </w:tr>
       <w:tr>
-        <w:tblPrEx>
-          <w:tblCellMar>
-            <w:top w:w="0" w:type="dxa"/>
-            <w:bottom w:w="0" w:type="dxa"/>
-          </w:tblCellMar>
-        </w:tblPrEx>
         <w:tc>
           <w:tcPr>
             <w:tcW w:w="3200" w:type="dxa"/>
@@ -2675,12 +2630,6 @@
         </w:tc>
       </w:tr>
       <w:tr>
-        <w:tblPrEx>
-          <w:tblCellMar>
-            <w:top w:w="0" w:type="dxa"/>
-            <w:bottom w:w="0" w:type="dxa"/>
-          </w:tblCellMar>
-        </w:tblPrEx>
         <w:tc>
           <w:tcPr>
             <w:tcW w:w="3200" w:type="dxa"/>
@@ -2737,12 +2686,6 @@
         </w:tc>
       </w:tr>
       <w:tr>
-        <w:tblPrEx>
-          <w:tblCellMar>
-            <w:top w:w="0" w:type="dxa"/>
-            <w:bottom w:w="0" w:type="dxa"/>
-          </w:tblCellMar>
-        </w:tblPrEx>
         <w:tc>
           <w:tcPr>
             <w:tcW w:w="3200" w:type="dxa"/>
@@ -2824,12 +2767,6 @@
         </w:tc>
       </w:tr>
       <w:tr>
-        <w:tblPrEx>
-          <w:tblCellMar>
-            <w:top w:w="0" w:type="dxa"/>
-            <w:bottom w:w="0" w:type="dxa"/>
-          </w:tblCellMar>
-        </w:tblPrEx>
         <w:tc>
           <w:tcPr>
             <w:tcW w:w="3200" w:type="dxa"/>
@@ -2886,12 +2823,6 @@
         </w:tc>
       </w:tr>
       <w:tr>
-        <w:tblPrEx>
-          <w:tblCellMar>
-            <w:top w:w="0" w:type="dxa"/>
-            <w:bottom w:w="0" w:type="dxa"/>
-          </w:tblCellMar>
-        </w:tblPrEx>
         <w:tc>
           <w:tcPr>
             <w:tcW w:w="3200" w:type="dxa"/>
@@ -2948,12 +2879,6 @@
         </w:tc>
       </w:tr>
       <w:tr>
-        <w:tblPrEx>
-          <w:tblCellMar>
-            <w:top w:w="0" w:type="dxa"/>
-            <w:bottom w:w="0" w:type="dxa"/>
-          </w:tblCellMar>
-        </w:tblPrEx>
         <w:tc>
           <w:tcPr>
             <w:tcW w:w="3200" w:type="dxa"/>
@@ -3019,12 +2944,6 @@
         </w:tc>
       </w:tr>
       <w:tr>
-        <w:tblPrEx>
-          <w:tblCellMar>
-            <w:top w:w="0" w:type="dxa"/>
-            <w:bottom w:w="0" w:type="dxa"/>
-          </w:tblCellMar>
-        </w:tblPrEx>
         <w:tc>
           <w:tcPr>
             <w:tcW w:w="3200" w:type="dxa"/>
@@ -3115,12 +3034,6 @@
         </w:tc>
       </w:tr>
       <w:tr>
-        <w:tblPrEx>
-          <w:tblCellMar>
-            <w:top w:w="0" w:type="dxa"/>
-            <w:bottom w:w="0" w:type="dxa"/>
-          </w:tblCellMar>
-        </w:tblPrEx>
         <w:tc>
           <w:tcPr>
             <w:tcW w:w="3200" w:type="dxa"/>
@@ -3193,12 +3106,6 @@
         </w:tc>
       </w:tr>
       <w:tr>
-        <w:tblPrEx>
-          <w:tblCellMar>
-            <w:top w:w="0" w:type="dxa"/>
-            <w:bottom w:w="0" w:type="dxa"/>
-          </w:tblCellMar>
-        </w:tblPrEx>
         <w:tc>
           <w:tcPr>
             <w:tcW w:w="3200" w:type="dxa"/>
@@ -3280,12 +3187,6 @@
         </w:tc>
       </w:tr>
       <w:tr>
-        <w:tblPrEx>
-          <w:tblCellMar>
-            <w:top w:w="0" w:type="dxa"/>
-            <w:bottom w:w="0" w:type="dxa"/>
-          </w:tblCellMar>
-        </w:tblPrEx>
         <w:tc>
           <w:tcPr>
             <w:tcW w:w="3200" w:type="dxa"/>
@@ -3351,12 +3252,6 @@
         </w:tc>
       </w:tr>
       <w:tr>
-        <w:tblPrEx>
-          <w:tblCellMar>
-            <w:top w:w="0" w:type="dxa"/>
-            <w:bottom w:w="0" w:type="dxa"/>
-          </w:tblCellMar>
-        </w:tblPrEx>
         <w:tc>
           <w:tcPr>
             <w:tcW w:w="3200" w:type="dxa"/>
@@ -3438,12 +3333,6 @@
         </w:tc>
       </w:tr>
       <w:tr>
-        <w:tblPrEx>
-          <w:tblCellMar>
-            <w:top w:w="0" w:type="dxa"/>
-            <w:bottom w:w="0" w:type="dxa"/>
-          </w:tblCellMar>
-        </w:tblPrEx>
         <w:tc>
           <w:tcPr>
             <w:tcW w:w="3200" w:type="dxa"/>
@@ -3501,12 +3390,6 @@
         </w:tc>
       </w:tr>
       <w:tr>
-        <w:tblPrEx>
-          <w:tblCellMar>
-            <w:top w:w="0" w:type="dxa"/>
-            <w:bottom w:w="0" w:type="dxa"/>
-          </w:tblCellMar>
-        </w:tblPrEx>
         <w:tc>
           <w:tcPr>
             <w:tcW w:w="3200" w:type="dxa"/>
@@ -3604,12 +3487,6 @@
         <w:gridCol w:w="6160"/>
       </w:tblGrid>
       <w:tr>
-        <w:tblPrEx>
-          <w:tblCellMar>
-            <w:top w:w="0" w:type="dxa"/>
-            <w:bottom w:w="0" w:type="dxa"/>
-          </w:tblCellMar>
-        </w:tblPrEx>
         <w:trPr>
           <w:tblHeader/>
         </w:trPr>
@@ -3673,12 +3550,6 @@
         </w:tc>
       </w:tr>
       <w:tr>
-        <w:tblPrEx>
-          <w:tblCellMar>
-            <w:top w:w="0" w:type="dxa"/>
-            <w:bottom w:w="0" w:type="dxa"/>
-          </w:tblCellMar>
-        </w:tblPrEx>
         <w:tc>
           <w:tcPr>
             <w:tcW w:w="3200" w:type="dxa"/>
@@ -3735,12 +3606,6 @@
         </w:tc>
       </w:tr>
       <w:tr>
-        <w:tblPrEx>
-          <w:tblCellMar>
-            <w:top w:w="0" w:type="dxa"/>
-            <w:bottom w:w="0" w:type="dxa"/>
-          </w:tblCellMar>
-        </w:tblPrEx>
         <w:tc>
           <w:tcPr>
             <w:tcW w:w="3200" w:type="dxa"/>
@@ -3797,12 +3662,6 @@
         </w:tc>
       </w:tr>
       <w:tr>
-        <w:tblPrEx>
-          <w:tblCellMar>
-            <w:top w:w="0" w:type="dxa"/>
-            <w:bottom w:w="0" w:type="dxa"/>
-          </w:tblCellMar>
-        </w:tblPrEx>
         <w:tc>
           <w:tcPr>
             <w:tcW w:w="3200" w:type="dxa"/>
@@ -3861,12 +3720,6 @@
         </w:tc>
       </w:tr>
       <w:tr>
-        <w:tblPrEx>
-          <w:tblCellMar>
-            <w:top w:w="0" w:type="dxa"/>
-            <w:bottom w:w="0" w:type="dxa"/>
-          </w:tblCellMar>
-        </w:tblPrEx>
         <w:tc>
           <w:tcPr>
             <w:tcW w:w="3200" w:type="dxa"/>
@@ -3925,12 +3778,6 @@
         </w:tc>
       </w:tr>
       <w:tr>
-        <w:tblPrEx>
-          <w:tblCellMar>
-            <w:top w:w="0" w:type="dxa"/>
-            <w:bottom w:w="0" w:type="dxa"/>
-          </w:tblCellMar>
-        </w:tblPrEx>
         <w:tc>
           <w:tcPr>
             <w:tcW w:w="3200" w:type="dxa"/>
@@ -3996,12 +3843,6 @@
         </w:tc>
       </w:tr>
       <w:tr>
-        <w:tblPrEx>
-          <w:tblCellMar>
-            <w:top w:w="0" w:type="dxa"/>
-            <w:bottom w:w="0" w:type="dxa"/>
-          </w:tblCellMar>
-        </w:tblPrEx>
         <w:tc>
           <w:tcPr>
             <w:tcW w:w="3200" w:type="dxa"/>
@@ -4058,12 +3899,6 @@
         </w:tc>
       </w:tr>
       <w:tr>
-        <w:tblPrEx>
-          <w:tblCellMar>
-            <w:top w:w="0" w:type="dxa"/>
-            <w:bottom w:w="0" w:type="dxa"/>
-          </w:tblCellMar>
-        </w:tblPrEx>
         <w:tc>
           <w:tcPr>
             <w:tcW w:w="3200" w:type="dxa"/>
@@ -4120,12 +3955,6 @@
         </w:tc>
       </w:tr>
       <w:tr>
-        <w:tblPrEx>
-          <w:tblCellMar>
-            <w:top w:w="0" w:type="dxa"/>
-            <w:bottom w:w="0" w:type="dxa"/>
-          </w:tblCellMar>
-        </w:tblPrEx>
         <w:tc>
           <w:tcPr>
             <w:tcW w:w="3200" w:type="dxa"/>
@@ -4182,12 +4011,6 @@
         </w:tc>
       </w:tr>
       <w:tr>
-        <w:tblPrEx>
-          <w:tblCellMar>
-            <w:top w:w="0" w:type="dxa"/>
-            <w:bottom w:w="0" w:type="dxa"/>
-          </w:tblCellMar>
-        </w:tblPrEx>
         <w:tc>
           <w:tcPr>
             <w:tcW w:w="3200" w:type="dxa"/>
@@ -4246,12 +4069,6 @@
         </w:tc>
       </w:tr>
       <w:tr>
-        <w:tblPrEx>
-          <w:tblCellMar>
-            <w:top w:w="0" w:type="dxa"/>
-            <w:bottom w:w="0" w:type="dxa"/>
-          </w:tblCellMar>
-        </w:tblPrEx>
         <w:tc>
           <w:tcPr>
             <w:tcW w:w="3200" w:type="dxa"/>
@@ -4326,12 +4143,6 @@
         </w:tc>
       </w:tr>
       <w:tr>
-        <w:tblPrEx>
-          <w:tblCellMar>
-            <w:top w:w="0" w:type="dxa"/>
-            <w:bottom w:w="0" w:type="dxa"/>
-          </w:tblCellMar>
-        </w:tblPrEx>
         <w:tc>
           <w:tcPr>
             <w:tcW w:w="3200" w:type="dxa"/>
@@ -4413,12 +4224,6 @@
         </w:tc>
       </w:tr>
       <w:tr>
-        <w:tblPrEx>
-          <w:tblCellMar>
-            <w:top w:w="0" w:type="dxa"/>
-            <w:bottom w:w="0" w:type="dxa"/>
-          </w:tblCellMar>
-        </w:tblPrEx>
         <w:tc>
           <w:tcPr>
             <w:tcW w:w="3200" w:type="dxa"/>
@@ -4484,12 +4289,6 @@
         </w:tc>
       </w:tr>
       <w:tr>
-        <w:tblPrEx>
-          <w:tblCellMar>
-            <w:top w:w="0" w:type="dxa"/>
-            <w:bottom w:w="0" w:type="dxa"/>
-          </w:tblCellMar>
-        </w:tblPrEx>
         <w:tc>
           <w:tcPr>
             <w:tcW w:w="3200" w:type="dxa"/>
@@ -4571,12 +4370,6 @@
         </w:tc>
       </w:tr>
       <w:tr>
-        <w:tblPrEx>
-          <w:tblCellMar>
-            <w:top w:w="0" w:type="dxa"/>
-            <w:bottom w:w="0" w:type="dxa"/>
-          </w:tblCellMar>
-        </w:tblPrEx>
         <w:tc>
           <w:tcPr>
             <w:tcW w:w="3200" w:type="dxa"/>
@@ -5519,6 +5312,7 @@
       </w:pPr>
       <w:r>
         <w:rPr>
+          <w:noProof/>
           <w:color w:val="auto"/>
         </w:rPr>
         <w:drawing>
@@ -5587,6 +5381,7 @@
       </w:pPr>
       <w:r>
         <w:rPr>
+          <w:noProof/>
           <w:color w:val="auto"/>
         </w:rPr>
         <w:drawing>
@@ -5655,6 +5450,7 @@
       </w:pPr>
       <w:r>
         <w:rPr>
+          <w:noProof/>
           <w:color w:val="auto"/>
         </w:rPr>
         <w:lastRenderedPageBreak/>
@@ -5728,6 +5524,7 @@
       </w:pPr>
       <w:r>
         <w:rPr>
+          <w:noProof/>
           <w:color w:val="auto"/>
           <w:sz w:val="28"/>
           <w:szCs w:val="28"/>
@@ -5802,6 +5599,7 @@
       </w:pPr>
       <w:r>
         <w:rPr>
+          <w:noProof/>
           <w:color w:val="auto"/>
           <w:sz w:val="28"/>
           <w:szCs w:val="28"/>
@@ -5877,6 +5675,7 @@
       </w:pPr>
       <w:r>
         <w:rPr>
+          <w:noProof/>
           <w:color w:val="auto"/>
           <w:sz w:val="28"/>
           <w:szCs w:val="28"/>
@@ -5960,6 +5759,7 @@
       </w:pPr>
       <w:r>
         <w:rPr>
+          <w:noProof/>
           <w:color w:val="auto"/>
           <w:sz w:val="28"/>
           <w:szCs w:val="28"/>
@@ -6035,6 +5835,7 @@
       </w:pPr>
       <w:r>
         <w:rPr>
+          <w:noProof/>
           <w:color w:val="auto"/>
           <w:sz w:val="28"/>
           <w:szCs w:val="28"/>
@@ -6119,6 +5920,7 @@
       </w:pPr>
       <w:r>
         <w:rPr>
+          <w:noProof/>
           <w:color w:val="auto"/>
           <w:sz w:val="28"/>
           <w:szCs w:val="28"/>
@@ -6194,6 +5996,7 @@
       </w:pPr>
       <w:r>
         <w:rPr>
+          <w:noProof/>
           <w:color w:val="auto"/>
           <w:sz w:val="28"/>
           <w:szCs w:val="28"/>

</xml_diff>